<commit_message>
SmartStart: rewrite Endless Land and Sea for owners, add Roads and Cities (coming soon)
Co-Authored-By: Claude Opus 5.5 <noreply@anthropic.com>
</commit_message>
<xml_diff>
--- a/SmartStart.docx
+++ b/SmartStart.docx
@@ -2185,13 +2185,13 @@
         <w:pStyle w:val="Heading1"/>
       </w:pPr>
       <w:r>
-        <w:t>En</w:t>
-      </w:r>
-      <w:r>
-        <w:t>D</w:t>
-      </w:r>
-      <w:r>
-        <w:t>less Land and Sea</w:t>
+        <w:t>Endless Land and Sea</w:t>
+      </w:r>
+      <w:r>
+        <w:t/>
+      </w:r>
+      <w:r>
+        <w:t/>
       </w:r>
     </w:p>
     <w:p>
@@ -2311,67 +2311,192 @@
     </w:p>
     <w:bookmarkEnd w:id="0"/>
     <w:p>
-      <w:r>
-        <w:t>When enabled, and the Fill size is set to 1, then any avatar arrival in the center will generate a new set of regions surrounding that region</w:t>
-      </w:r>
-      <w:r>
-        <w:t xml:space="preserve">. </w:t>
-      </w:r>
-      <w:r>
-        <w:t>These regions may be Temporary or Perm</w:t>
-      </w:r>
-      <w:r>
-        <w:t>a</w:t>
-      </w:r>
-      <w:r>
-        <w:t>nent</w:t>
-      </w:r>
-      <w:r>
-        <w:t xml:space="preserve">. </w:t>
-      </w:r>
-      <w:r>
-        <w:t xml:space="preserve">If set to </w:t>
-      </w:r>
-      <w:r>
-        <w:t>Temporary, when</w:t>
-      </w:r>
-      <w:r>
-        <w:t xml:space="preserve"> the avatar leaves, the regions will be </w:t>
-      </w:r>
-      <w:r>
-        <w:t>removed</w:t>
-      </w:r>
-      <w:r>
-        <w:t xml:space="preserve">, and all traces of the region </w:t>
-      </w:r>
-      <w:r>
-        <w:t xml:space="preserve">removed. </w:t>
-      </w:r>
-      <w:r>
-        <w:t xml:space="preserve">There is also a button to </w:t>
-      </w:r>
-      <w:r>
-        <w:t>remove</w:t>
-      </w:r>
-      <w:r>
-        <w:t xml:space="preserve"> all these regions on demand.</w:t>
-      </w:r>
-    </w:p>
-    <w:p>
-      <w:r>
-        <w:t xml:space="preserve">This setting shows Temporary regions are </w:t>
-      </w:r>
-      <w:r>
-        <w:t>Enabled, if</w:t>
-      </w:r>
-      <w:r>
-        <w:t xml:space="preserve"> the Enabled switch is </w:t>
-      </w:r>
-      <w:r>
-        <w:t>set, when</w:t>
-      </w:r>
-      <w:r>
-        <w:t xml:space="preserve"> an avatar arrives in a region a new DOS box will be generated with surrounding the center region.</w:t>
+      <w:pPr>
+        <w:pStyle w:val="Heading2"/>
+      </w:pPr>
+      <w:r>
+        <w:t xml:space="preserve">How it works</w:t>
+      </w:r>
+    </w:p>
+    <w:p>
+      <w:r>
+        <w:t xml:space="preserve">Think of a tic-tac-toe board. The region a visitor arrives in is the middle square.</w:t>
+      </w:r>
+    </w:p>
+    <w:p>
+      <w:r>
+        <w:t xml:space="preserve">- DreamGrid looks at the squares around it.</w:t>
+      </w:r>
+    </w:p>
+    <w:p>
+      <w:r>
+        <w:t xml:space="preserve">- Every empty square gets a new region with a random name, and DreamGrid starts it.</w:t>
+      </w:r>
+    </w:p>
+    <w:p>
+      <w:r>
+        <w:t xml:space="preserve">- When the visitor walks, flies or sails into a new region, that region becomes the middle square, and it all happens again.</w:t>
+      </w:r>
+    </w:p>
+    <w:p>
+      <w:r>
+        <w:t xml:space="preserve">So wherever a visitor goes, there is always more world ahead. They never reach the edge of the map.</w:t>
+      </w:r>
+    </w:p>
+    <w:p>
+      <w:pPr>
+        <w:pStyle w:val="Heading2"/>
+      </w:pPr>
+      <w:r>
+        <w:t xml:space="preserve">How far out it builds</w:t>
+      </w:r>
+    </w:p>
+    <w:p>
+      <w:r>
+        <w:t xml:space="preserve">The Fill Size sets how many rings of new regions are built around the visitor:</w:t>
+      </w:r>
+    </w:p>
+    <w:p>
+      <w:r>
+        <w:t xml:space="preserve">- 1 ring: up to 8 new regions.</w:t>
+      </w:r>
+    </w:p>
+    <w:p>
+      <w:r>
+        <w:t xml:space="preserve">- 2 rings: up to 24 new regions.</w:t>
+      </w:r>
+    </w:p>
+    <w:p>
+      <w:r>
+        <w:t xml:space="preserve">- 3 rings: up to 48 new regions.</w:t>
+      </w:r>
+    </w:p>
+    <w:p>
+      <w:r>
+        <w:t xml:space="preserve">Visitors can see about 4 regions away, so more rings fill the horizon. More rings look better, but need a stronger computer.</w:t>
+      </w:r>
+    </w:p>
+    <w:p>
+      <w:pPr>
+        <w:pStyle w:val="Heading2"/>
+      </w:pPr>
+      <w:r>
+        <w:t xml:space="preserve">What the new regions look like</w:t>
+      </w:r>
+    </w:p>
+    <w:p>
+      <w:r>
+        <w:t xml:space="preserve">- Water: open sea to sail or fly over.</w:t>
+      </w:r>
+    </w:p>
+    <w:p>
+      <w:r>
+        <w:t xml:space="preserve">- Land: ground to walk on, flat or with hills and mountains. Trees and plants can be added.</w:t>
+      </w:r>
+    </w:p>
+    <w:p>
+      <w:r>
+        <w:t xml:space="preserve">The Landscaping and Trees/Plants screens set how the land and plants look.</w:t>
+      </w:r>
+    </w:p>
+    <w:p>
+      <w:pPr>
+        <w:pStyle w:val="Heading2"/>
+      </w:pPr>
+      <w:r>
+        <w:t xml:space="preserve">Temporary regions</w:t>
+      </w:r>
+    </w:p>
+    <w:p>
+      <w:r>
+        <w:t xml:space="preserve">- Temporary on: when the visitor moves away, the regions built for them are deleted again. This saves memory and disk space.</w:t>
+      </w:r>
+    </w:p>
+    <w:p>
+      <w:r>
+        <w:t xml:space="preserve">- Temporary off: the new regions stay, and your world keeps growing.</w:t>
+      </w:r>
+    </w:p>
+    <w:p>
+      <w:r>
+        <w:t xml:space="preserve">Temporary only removes regions built by Endless Land and Sea. Regions you made yourself are never touched. If a visitor comes back to a place that was deleted, it is built fresh, so it may look different.</w:t>
+      </w:r>
+    </w:p>
+    <w:p>
+      <w:pPr>
+        <w:pStyle w:val="Heading2"/>
+      </w:pPr>
+      <w:r>
+        <w:t xml:space="preserve">Delete All Autofill Regions</w:t>
+      </w:r>
+    </w:p>
+    <w:p>
+      <w:r>
+        <w:t xml:space="preserve">This button removes every region Endless Land and Sea has built, at any time. Your own regions are never touched. Stop your regions first. The button asks you to confirm.</w:t>
+      </w:r>
+    </w:p>
+    <w:p>
+      <w:pPr>
+        <w:pStyle w:val="Heading2"/>
+      </w:pPr>
+      <w:r>
+        <w:t xml:space="preserve">Roads and Cities (coming soon)</w:t>
+      </w:r>
+    </w:p>
+    <w:p>
+      <w:r>
+        <w:t xml:space="preserve">A future version adds roads and cities to the new regions.</w:t>
+      </w:r>
+    </w:p>
+    <w:p>
+      <w:r>
+        <w:t xml:space="preserve">Each road region has roads leaving by some of its four sides: north, east, south or west.</w:t>
+      </w:r>
+    </w:p>
+    <w:p>
+      <w:r>
+        <w:rPr>
+          <w:b/>
+        </w:rPr>
+        <w:t xml:space="preserve">The one rule is that all roads must fit:</w:t>
+      </w:r>
+    </w:p>
+    <w:p>
+      <w:r>
+        <w:t xml:space="preserve">- A road leaving the east side meets a road coming in on the west side of the next region.</w:t>
+      </w:r>
+    </w:p>
+    <w:p>
+      <w:r>
+        <w:t xml:space="preserve">- A road leaving the north side meets a road coming in from the south.</w:t>
+      </w:r>
+    </w:p>
+    <w:p>
+      <w:r>
+        <w:t xml:space="preserve">- A side with no road faces a side with no road.</w:t>
+      </w:r>
+    </w:p>
+    <w:p>
+      <w:r>
+        <w:t xml:space="preserve">So roads never stop dead against a wall, and they never run into your own regions. Your Welcome region has no roads, so no new road ever points into it. DreamGrid picks each road region at random from the pieces that fit, so every trip can look a little different.</w:t>
+      </w:r>
+    </w:p>
+    <w:p>
+      <w:r>
+        <w:t xml:space="preserve">Roads cut each region into four corners. On a plain road region, DreamGrid can put a building, such as a gas station or a bakery, on none, some or all of the four corners. A City region already has all its buildings, so nothing is added to it.</w:t>
+      </w:r>
+    </w:p>
+    <w:p>
+      <w:pPr>
+        <w:pStyle w:val="Heading2"/>
+      </w:pPr>
+      <w:r>
+        <w:t xml:space="preserve">Building by hand</w:t>
+      </w:r>
+    </w:p>
+    <w:p>
+      <w:r>
+        <w:t xml:space="preserve">You can still place regions yourself. In the Region Map Editor, drag and drop water, road and city regions exactly where you want them.</w:t>
       </w:r>
       <w:bookmarkEnd w:id="1"/>
     </w:p>

</xml_diff>